<commit_message>
Instalador: descarrega a aplicação quando executado fora da pasta
O instalar.bat executado sozinho (ex.: a partir das Transferências) falhava por não
encontrar o requirements.txt. Agora deteta a situação, descarrega o ZIP do ramo para
%USERPROFILE%\Medicoes e continua a instalação a partir daí; o iniciar.bat procura
a aplicação nessa pasta. Guia atualizado. Testado com Python 3.14 / pandas 3.0.

Co-Authored-By: Claude Opus 5.5 <noreply@anthropic.com>
Claude-Session: https://claude.ai/code/session_01Cau5DqMtBzmwpL1GzXVZBz
</commit_message>
<xml_diff>
--- a/docs/Guia_Utilizacao_Medicoes_DWG_MQ.docx
+++ b/docs/Guia_Utilizacao_Medicoes_DWG_MQ.docx
@@ -1229,6 +1229,33 @@
           <w:szCs w:val="22"/>
         </w:rPr>
         <w:t xml:space="preserve">Se o instalador abrir a página do Python ou do ODA, é porque esse programa não foi encontrado: instale-o e volte a executar o instalar.bat.</w:t>
+      </w:r>
+    </w:p>
+    <w:p>
+      <w:pPr>
+        <w:pBdr>
+          <w:left w:val="single" w:color="1F4E78" w:sz="18" w:space="6"/>
+        </w:pBdr>
+        <w:shd w:fill="E8F1FB" w:val="clear"/>
+        <w:spacing w:after="160" w:before="80"/>
+      </w:pPr>
+      <w:r>
+        <w:rPr>
+          <w:rFonts w:ascii="Calibri" w:cs="Calibri" w:eastAsia="Calibri" w:hAnsi="Calibri"/>
+          <w:b/>
+          <w:bCs/>
+          <w:sz w:val="22"/>
+          <w:szCs w:val="22"/>
+        </w:rPr>
+        <w:t xml:space="preserve">Dica: </w:t>
+      </w:r>
+      <w:r>
+        <w:rPr>
+          <w:rFonts w:ascii="Calibri" w:cs="Calibri" w:eastAsia="Calibri" w:hAnsi="Calibri"/>
+          <w:sz w:val="22"/>
+          <w:szCs w:val="22"/>
+        </w:rPr>
+        <w:t xml:space="preserve">Se executar o instalar.bat fora da pasta da aplicação (por exemplo, a partir das Transferências), ele descarrega a aplicação do GitHub para C:\Users\&lt;utilizador&gt;\Medicoes e continua a instalação a partir daí. Nesse caso, pode saltar o passo 2.2.</w:t>
       </w:r>
     </w:p>
     <w:p>

</xml_diff>